<commit_message>
Data Model Explorer 4.0: tidier ERD side panel, exports in one menu
- Tables first (with a ticked count), then Show, with the rest folded under
  Layout and options (summary line, open state remembered)
- Tick/Untick all shown only while filtering
- draw.io, SVG, PNG and Mermaid exports in one Export menu
- Guide ERD section and screenshot updated; 335 tests

Co-Authored-By: Claude Opus 5.5 <noreply@anthropic.com>
Claude-Session: https://claude.ai/code/session_01SKe3s5TvTWyeqUT38hd6Ss
</commit_message>
<xml_diff>
--- a/data-model-explorer-v4/docs/User_Guide.docx
+++ b/data-model-explorer-v4/docs/User_Guide.docx
@@ -380,6 +380,47 @@
           <w:b/>
         </w:rPr>
         <w:t xml:space="preserve">New in 4.0</w:t>
+      </w:r>
+    </w:p>
+    <w:p>
+      <w:pPr>
+        <w:numPr>
+          <w:ilvl w:val="0"/>
+          <w:numId w:val="1001"/>
+        </w:numPr>
+        <w:pStyle w:val="Compact"/>
+      </w:pPr>
+      <w:r>
+        <w:t xml:space="preserve">A tidier ERD panel: tables first, display settings folded under</w:t>
+      </w:r>
+      <w:r>
+        <w:t xml:space="preserve"> </w:t>
+      </w:r>
+      <w:r>
+        <w:rPr>
+          <w:bCs/>
+          <w:b/>
+        </w:rPr>
+        <w:t xml:space="preserve">Layout and options</w:t>
+      </w:r>
+      <w:r>
+        <w:t xml:space="preserve">, and the exports in one</w:t>
+      </w:r>
+      <w:r>
+        <w:t xml:space="preserve"> </w:t>
+      </w:r>
+      <w:r>
+        <w:rPr>
+          <w:bCs/>
+          <w:b/>
+        </w:rPr>
+        <w:t xml:space="preserve">Export ▾</w:t>
+      </w:r>
+      <w:r>
+        <w:t xml:space="preserve"> </w:t>
+      </w:r>
+      <w:r>
+        <w:t xml:space="preserve">menu (The ERD).</w:t>
       </w:r>
     </w:p>
     <w:p>
@@ -3415,6 +3456,14 @@
     </w:p>
     <w:p>
       <w:pPr>
+        <w:pStyle w:val="BodyText"/>
+      </w:pPr>
+      <w:r>
+        <w:t xml:space="preserve">The side panel has the tables at the top and the display settings at the bottom.</w:t>
+      </w:r>
+    </w:p>
+    <w:p>
+      <w:pPr>
         <w:numPr>
           <w:ilvl w:val="0"/>
           <w:numId w:val="1006"/>
@@ -3422,20 +3471,23 @@
         <w:pStyle w:val="Compact"/>
       </w:pPr>
       <w:r>
-        <w:t xml:space="preserve">Pick tables in the list on the left: tick them one by one, filter by name or area and use</w:t>
-      </w:r>
-      <w:r>
-        <w:t xml:space="preserve"> </w:t>
-      </w:r>
-      <w:r>
-        <w:rPr>
-          <w:bCs/>
-          <w:b/>
-        </w:rPr>
-        <w:t xml:space="preserve">Select shown</w:t>
-      </w:r>
-      <w:r>
-        <w:t xml:space="preserve">, or use</w:t>
+        <w:t xml:space="preserve">Pick tables under</w:t>
+      </w:r>
+      <w:r>
+        <w:t xml:space="preserve"> </w:t>
+      </w:r>
+      <w:r>
+        <w:rPr>
+          <w:bCs/>
+          <w:b/>
+        </w:rPr>
+        <w:t xml:space="preserve">Tables</w:t>
+      </w:r>
+      <w:r>
+        <w:t xml:space="preserve"> </w:t>
+      </w:r>
+      <w:r>
+        <w:t xml:space="preserve">(it says how many are ticked): tick them one by one, use</w:t>
       </w:r>
       <w:r>
         <w:t xml:space="preserve"> </w:t>
@@ -3461,10 +3513,7 @@
         <w:t xml:space="preserve">All</w:t>
       </w:r>
       <w:r>
-        <w:t xml:space="preserve"> </w:t>
-      </w:r>
-      <w:r>
-        <w:t xml:space="preserve">and</w:t>
+        <w:t xml:space="preserve">,</w:t>
       </w:r>
       <w:r>
         <w:t xml:space="preserve"> </w:t>
@@ -3477,7 +3526,39 @@
         <w:t xml:space="preserve">None</w:t>
       </w:r>
       <w:r>
-        <w:t xml:space="preserve">.</w:t>
+        <w:t xml:space="preserve"> </w:t>
+      </w:r>
+      <w:r>
+        <w:t xml:space="preserve">or</w:t>
+      </w:r>
+      <w:r>
+        <w:t xml:space="preserve"> </w:t>
+      </w:r>
+      <w:r>
+        <w:rPr>
+          <w:bCs/>
+          <w:b/>
+        </w:rPr>
+        <w:t xml:space="preserve">Area ▾</w:t>
+      </w:r>
+      <w:r>
+        <w:t xml:space="preserve">, or type in the filter box and use</w:t>
+      </w:r>
+      <w:r>
+        <w:t xml:space="preserve"> </w:t>
+      </w:r>
+      <w:r>
+        <w:rPr>
+          <w:bCs/>
+          <w:b/>
+        </w:rPr>
+        <w:t xml:space="preserve">Tick all shown</w:t>
+      </w:r>
+      <w:r>
+        <w:t xml:space="preserve"> </w:t>
+      </w:r>
+      <w:r>
+        <w:t xml:space="preserve">(it appears while you filter).</w:t>
       </w:r>
     </w:p>
     <w:p>
@@ -3530,7 +3611,23 @@
         <w:pStyle w:val="Compact"/>
       </w:pPr>
       <w:r>
-        <w:t xml:space="preserve">Choose what each box shows (</w:t>
+        <w:t xml:space="preserve">Under</w:t>
+      </w:r>
+      <w:r>
+        <w:t xml:space="preserve"> </w:t>
+      </w:r>
+      <w:r>
+        <w:rPr>
+          <w:bCs/>
+          <w:b/>
+        </w:rPr>
+        <w:t xml:space="preserve">Show</w:t>
+      </w:r>
+      <w:r>
+        <w:t xml:space="preserve">, choose what each box shows:</w:t>
+      </w:r>
+      <w:r>
+        <w:t xml:space="preserve"> </w:t>
       </w:r>
       <w:r>
         <w:rPr>
@@ -3569,7 +3666,23 @@
         <w:t xml:space="preserve">All fields</w:t>
       </w:r>
       <w:r>
-        <w:t xml:space="preserve">), the</w:t>
+        <w:t xml:space="preserve">.</w:t>
+      </w:r>
+      <w:r>
+        <w:t xml:space="preserve"> </w:t>
+      </w:r>
+      <w:r>
+        <w:rPr>
+          <w:bCs/>
+          <w:b/>
+        </w:rPr>
+        <w:t xml:space="preserve">Layout and options</w:t>
+      </w:r>
+      <w:r>
+        <w:t xml:space="preserve"> </w:t>
+      </w:r>
+      <w:r>
+        <w:t xml:space="preserve">(closed until you open it; the line under it sums up what is set) has the</w:t>
       </w:r>
       <w:r>
         <w:t xml:space="preserve"> </w:t>
@@ -3582,10 +3695,7 @@
         <w:t xml:space="preserve">Direction</w:t>
       </w:r>
       <w:r>
-        <w:t xml:space="preserve"> </w:t>
-      </w:r>
-      <w:r>
-        <w:t xml:space="preserve">and when relationship names show.</w:t>
+        <w:t xml:space="preserve">, when relationship names show, which tables are drawn, and colour by area.</w:t>
       </w:r>
       <w:r>
         <w:t xml:space="preserve"> </w:t>
@@ -3891,6 +4001,22 @@
         <w:t xml:space="preserve"> </w:t>
       </w:r>
       <w:r>
+        <w:t xml:space="preserve">Filter tables ·</w:t>
+      </w:r>
+      <w:r>
+        <w:t xml:space="preserve"> </w:t>
+      </w:r>
+      <w:r>
+        <w:rPr>
+          <w:bCs/>
+          <w:b/>
+        </w:rPr>
+        <w:t xml:space="preserve">2</w:t>
+      </w:r>
+      <w:r>
+        <w:t xml:space="preserve"> </w:t>
+      </w:r>
+      <w:r>
         <w:t xml:space="preserve">All tables ·</w:t>
       </w:r>
       <w:r>
@@ -3901,7 +4027,7 @@
           <w:bCs/>
           <w:b/>
         </w:rPr>
-        <w:t xml:space="preserve">2</w:t>
+        <w:t xml:space="preserve">3</w:t>
       </w:r>
       <w:r>
         <w:t xml:space="preserve"> </w:t>
@@ -3917,13 +4043,45 @@
           <w:bCs/>
           <w:b/>
         </w:rPr>
-        <w:t xml:space="preserve">3</w:t>
-      </w:r>
-      <w:r>
-        <w:t xml:space="preserve"> </w:t>
-      </w:r>
-      <w:r>
-        <w:t xml:space="preserve">Export to draw.io</w:t>
+        <w:t xml:space="preserve">4</w:t>
+      </w:r>
+      <w:r>
+        <w:t xml:space="preserve"> </w:t>
+      </w:r>
+      <w:r>
+        <w:t xml:space="preserve">Layout and options ·</w:t>
+      </w:r>
+      <w:r>
+        <w:t xml:space="preserve"> </w:t>
+      </w:r>
+      <w:r>
+        <w:rPr>
+          <w:bCs/>
+          <w:b/>
+        </w:rPr>
+        <w:t xml:space="preserve">5</w:t>
+      </w:r>
+      <w:r>
+        <w:t xml:space="preserve"> </w:t>
+      </w:r>
+      <w:r>
+        <w:t xml:space="preserve">Export ▾ ·</w:t>
+      </w:r>
+      <w:r>
+        <w:t xml:space="preserve"> </w:t>
+      </w:r>
+      <w:r>
+        <w:rPr>
+          <w:bCs/>
+          <w:b/>
+        </w:rPr>
+        <w:t xml:space="preserve">6</w:t>
+      </w:r>
+      <w:r>
+        <w:t xml:space="preserve"> </w:t>
+      </w:r>
+      <w:r>
+        <w:t xml:space="preserve">draw.io</w:t>
       </w:r>
     </w:p>
     <w:p>
@@ -3998,13 +4156,13 @@
           <w:bCs/>
           <w:b/>
         </w:rPr>
-        <w:t xml:space="preserve">Options.</w:t>
-      </w:r>
-      <w:r>
-        <w:t xml:space="preserve"> </w:t>
-      </w:r>
-      <w:r>
-        <w:t xml:space="preserve">Show tables that selected tables look up to; hide tables with no relationships; also show tables that are not in the workbook; merge lines between the same two tables; hide user, team and business unit.</w:t>
+        <w:t xml:space="preserve">Options</w:t>
+      </w:r>
+      <w:r>
+        <w:t xml:space="preserve"> </w:t>
+      </w:r>
+      <w:r>
+        <w:t xml:space="preserve">(under Layout and options). Ticking a table also ticks the tables it relates to; show tables the ticked tables look up to; include tables not in the workbook; hide tables with no relationships; hide user, team and business unit; merge lines between the same two tables; colour by area.</w:t>
       </w:r>
     </w:p>
     <w:p>
@@ -4026,6 +4184,22 @@
           <w:bCs/>
           <w:b/>
         </w:rPr>
+        <w:t xml:space="preserve">Export ▾</w:t>
+      </w:r>
+      <w:r>
+        <w:t xml:space="preserve"> </w:t>
+      </w:r>
+      <w:r>
+        <w:t xml:space="preserve">above the diagram:</w:t>
+      </w:r>
+      <w:r>
+        <w:t xml:space="preserve"> </w:t>
+      </w:r>
+      <w:r>
+        <w:rPr>
+          <w:bCs/>
+          <w:b/>
+        </w:rPr>
         <w:t xml:space="preserve">draw.io</w:t>
       </w:r>
       <w:r>
@@ -4068,7 +4242,20 @@
           <w:bCs/>
           <w:b/>
         </w:rPr>
-        <w:t xml:space="preserve">.mmd</w:t>
+        <w:t xml:space="preserve">Mermaid (.mmd)</w:t>
+      </w:r>
+      <w:r>
+        <w:t xml:space="preserve">,</w:t>
+      </w:r>
+      <w:r>
+        <w:t xml:space="preserve"> </w:t>
+      </w:r>
+      <w:r>
+        <w:rPr>
+          <w:bCs/>
+          <w:b/>
+        </w:rPr>
+        <w:t xml:space="preserve">Copy Mermaid</w:t>
       </w:r>
       <w:r>
         <w:t xml:space="preserve"> </w:t>
@@ -4084,13 +4271,10 @@
           <w:bCs/>
           <w:b/>
         </w:rPr>
-        <w:t xml:space="preserve">Copy Mermaid</w:t>
-      </w:r>
-      <w:r>
-        <w:t xml:space="preserve"> </w:t>
-      </w:r>
-      <w:r>
-        <w:t xml:space="preserve">(the Mermaid source). Exports show what you see: the tables you picked, your layout, and only the relationships you have not hidden. The eyes are left out. A whole large model is hard to read, so a few dozen tables at a time usually works best.</w:t>
+        <w:t xml:space="preserve">Show Mermaid source</w:t>
+      </w:r>
+      <w:r>
+        <w:t xml:space="preserve">. Exports show what you see: the tables you picked, your layout, and only the relationships you have not hidden. The eyes are left out. A whole large model is hard to read, so a few dozen tables at a time usually works best.</w:t>
       </w:r>
     </w:p>
     <w:bookmarkEnd w:id="51"/>

</xml_diff>

<commit_message>
4.0.1, 5.0.1: rebuilt pages, solution zips, guides and the XrmToolBox dll
- Data_Model_Explorer.html rebuilt (empty template embedded)
- FORMUS_DataModelExplorer_4_0_1_0.zip and 5_0_1_0.zip replace 4_0_0_0 and 5_0_0_0
- Guide screenshots retaken and Word guides rebuilt
- xrmtoolbox/release/FormusPro.DataModelExplorer.XrmToolBox.dll rebuilt as 5.0.1 with this page

Co-Authored-By: Claude Opus 5.5 <noreply@anthropic.com>
Claude-Session: https://claude.ai/code/session_01SKe3s5TvTWyeqUT38hd6Ss
</commit_message>
<xml_diff>
--- a/data-model-explorer-v4/docs/User_Guide.docx
+++ b/data-model-explorer-v4/docs/User_Guide.docx
@@ -45,7 +45,7 @@
         <w:t xml:space="preserve"> </w:t>
       </w:r>
       <w:r>
-        <w:t xml:space="preserve">4.0.0</w:t>
+        <w:t xml:space="preserve">4.0.1</w:t>
       </w:r>
       <w:r>
         <w:t xml:space="preserve"> </w:t>
@@ -7105,7 +7105,7 @@
         <w:rPr>
           <w:rStyle w:val="VerbatimChar"/>
         </w:rPr>
-        <w:t xml:space="preserve">FORMUS_DataModelExplorer_4_0_0_0.zip</w:t>
+        <w:t xml:space="preserve">FORMUS_DataModelExplorer_4_0_1_0.zip</w:t>
       </w:r>
       <w:r>
         <w:t xml:space="preserve"> </w:t>
@@ -7247,7 +7247,7 @@
       <w:r>
         <w:drawing>
           <wp:inline>
-            <wp:extent cx="3172968" cy="4271303"/>
+            <wp:extent cx="3063240" cy="7318787"/>
             <wp:effectExtent b="0" l="0" r="0" t="0"/>
             <wp:docPr descr="This environment" title="" id="84" name="Picture"/>
             <a:graphic>
@@ -7268,7 +7268,7 @@
                   <pic:spPr bwMode="auto">
                     <a:xfrm>
                       <a:off x="0" y="0"/>
-                      <a:ext cx="3172968" cy="4271303"/>
+                      <a:ext cx="3063240" cy="7318787"/>
                     </a:xfrm>
                     <a:prstGeom prst="rect">
                       <a:avLst/>
@@ -7310,7 +7310,7 @@
         <w:t xml:space="preserve"> </w:t>
       </w:r>
       <w:r>
-        <w:t xml:space="preserve">Pick a solution ·</w:t>
+        <w:t xml:space="preserve">Find and pick a solution ·</w:t>
       </w:r>
       <w:r>
         <w:t xml:space="preserve"> </w:t>
@@ -7326,7 +7326,7 @@
         <w:t xml:space="preserve"> </w:t>
       </w:r>
       <w:r>
-        <w:t xml:space="preserve">Load as model ·</w:t>
+        <w:t xml:space="preserve">Load it as the model ·</w:t>
       </w:r>
       <w:r>
         <w:t xml:space="preserve"> </w:t>
@@ -7380,7 +7380,7 @@
         <w:pStyle w:val="Compact"/>
       </w:pPr>
       <w:r>
-        <w:t xml:space="preserve">Pick the solution, for example</w:t>
+        <w:t xml:space="preserve">Find the solution in the list and click it, for example</w:t>
       </w:r>
       <w:r>
         <w:t xml:space="preserve"> </w:t>
@@ -7392,7 +7392,23 @@
         <w:t xml:space="preserve">FORMUS import test</w:t>
       </w:r>
       <w:r>
-        <w:t xml:space="preserve">.</w:t>
+        <w:t xml:space="preserve">. Type in the search box to find it by name or unique name. Your unmanaged solutions are listed first; managed ones are folded under</w:t>
+      </w:r>
+      <w:r>
+        <w:t xml:space="preserve"> </w:t>
+      </w:r>
+      <w:r>
+        <w:rPr>
+          <w:bCs/>
+          <w:b/>
+        </w:rPr>
+        <w:t xml:space="preserve">Managed</w:t>
+      </w:r>
+      <w:r>
+        <w:t xml:space="preserve"> </w:t>
+      </w:r>
+      <w:r>
+        <w:t xml:space="preserve">and open when you click it or search.</w:t>
       </w:r>
     </w:p>
     <w:p>
@@ -7414,10 +7430,13 @@
           <w:bCs/>
           <w:b/>
         </w:rPr>
-        <w:t xml:space="preserve">Load as model</w:t>
-      </w:r>
-      <w:r>
-        <w:t xml:space="preserve">. The page reads the solution’s tables and, for each one, its columns, types, required levels, choice options, number and text settings, lookups with their cascade, and N:N relationships. Alternate keys are read too and shown on each table page under From Dataverse.</w:t>
+        <w:t xml:space="preserve">Load … as the model</w:t>
+      </w:r>
+      <w:r>
+        <w:t xml:space="preserve"> </w:t>
+      </w:r>
+      <w:r>
+        <w:t xml:space="preserve">(the button names the solution). The page reads the solution’s tables and, for each one, its columns, types, required levels, choice options, number and text settings, lookups with their cascade, and N:N relationships. Alternate keys are read too and shown on each table page under From Dataverse.</w:t>
       </w:r>
     </w:p>
     <w:p>
@@ -7617,7 +7636,7 @@
       <w:r>
         <w:drawing>
           <wp:inline>
-            <wp:extent cx="3172968" cy="4759452"/>
+            <wp:extent cx="3063240" cy="7318787"/>
             <wp:effectExtent b="0" l="0" r="0" t="0"/>
             <wp:docPr descr="The check against a managed environment" title="" id="89" name="Picture"/>
             <a:graphic>
@@ -7638,7 +7657,7 @@
                   <pic:spPr bwMode="auto">
                     <a:xfrm>
                       <a:off x="0" y="0"/>
-                      <a:ext cx="3172968" cy="4759452"/>
+                      <a:ext cx="3063240" cy="7318787"/>
                     </a:xfrm>
                     <a:prstGeom prst="rect">
                       <a:avLst/>
@@ -7905,7 +7924,7 @@
       <w:r>
         <w:drawing>
           <wp:inline>
-            <wp:extent cx="5334000" cy="3185583"/>
+            <wp:extent cx="5334000" cy="4815416"/>
             <wp:effectExtent b="0" l="0" r="0" t="0"/>
             <wp:docPr descr="The differences in Checks" title="" id="92" name="Picture"/>
             <a:graphic>
@@ -7926,7 +7945,7 @@
                   <pic:spPr bwMode="auto">
                     <a:xfrm>
                       <a:off x="0" y="0"/>
-                      <a:ext cx="5334000" cy="3185583"/>
+                      <a:ext cx="5334000" cy="4815416"/>
                     </a:xfrm>
                     <a:prstGeom prst="rect">
                       <a:avLst/>

</xml_diff>